<commit_message>
Mails de la clase del sábado: el M-1 sirve también para la base anterior; prompt de Cowork para sumarla
Co-Authored-By: Claude Opus 5.5 <noreply@anthropic.com>
Claude-Session: https://claude.ai/code/session_011cHZCWCbXV7WqvXcQ2jLM2
</commit_message>
<xml_diff>
--- a/agentes/mi-negocio/entregables/repesca-24-10-nutricion-mails.docx
+++ b/agentes/mi-negocio/entregables/repesca-24-10-nutricion-mails.docx
@@ -44,6 +44,24 @@
       </w:r>
       <w:r>
         <w:t xml:space="preserve">), pero cada mail se sostiene solo: mucha gente lee el mail y no el grupo.</w:t>
+      </w:r>
+    </w:p>
+    <w:p>
+      <w:pPr>
+        <w:pStyle w:val="BodyText"/>
+      </w:pPr>
+      <w:r>
+        <w:rPr>
+          <w:bCs/>
+          <w:b/>
+        </w:rPr>
+        <w:t xml:space="preserve">Para quién:</w:t>
+      </w:r>
+      <w:r>
+        <w:t xml:space="preserve"> </w:t>
+      </w:r>
+      <w:r>
+        <w:t xml:space="preserve">los que se registran para el sábado y también la base que se registró para la clase del lunes 19. Por eso ningún mail dice "te anotaste": sirven para los dos.</w:t>
       </w:r>
     </w:p>
     <w:p>
@@ -750,7 +768,7 @@
         <w:pStyle w:val="BlockText"/>
       </w:pPr>
       <w:r>
-        <w:t xml:space="preserve">Te anotaste a la clase en vivo privada del</w:t>
+        <w:t xml:space="preserve">Este</w:t>
       </w:r>
       <w:r>
         <w:t xml:space="preserve"> </w:t>
@@ -763,7 +781,10 @@
         <w:t xml:space="preserve">sábado 24 a las 18 hs</w:t>
       </w:r>
       <w:r>
-        <w:t xml:space="preserve">. Te voy a mostrar cómo podés escalar tu ecom a más de 100 millones de pesos por mes con el modelo de suscripción. Es la última vez que la doy en vivo.</w:t>
+        <w:t xml:space="preserve"> </w:t>
+      </w:r>
+      <w:r>
+        <w:t xml:space="preserve">doy la clase en vivo privada por última vez. Te voy a mostrar cómo podés escalar tu ecom a más de 100 millones de pesos por mes con el modelo de suscripción.</w:t>
       </w:r>
     </w:p>
     <w:p>

</xml_diff>